<commit_message>
Update resume skills and platform experience
Refresh the resume to reflect expanded AWS, MuleSoft, and API platform experience. This update adds cloud engineering details, platform modernization work, API governance and gateway automation, and strengthens the summary of SAP, commerce, and enterprise integration delivery. It also updates the generated PDF/DOCX artifacts to match the revised resume content.
</commit_message>
<xml_diff>
--- a/resumes/Thayagapriyan-Dravidamani-Resume.docx
+++ b/resumes/Thayagapriyan-Dravidamani-Resume.docx
@@ -189,7 +189,7 @@
           <w:color w:val="2B2B2B"/>
           <w:sz w:val="20"/>
         </w:rPr>
-        <w:t>AWS (S3, SES, MSK), GCP (BigQuery), GitHub Actions, Jenkins, Bamboo, Nexus, Docker</w:t>
+        <w:t>AWS (Lambda, API Gateway, IAM, VPC, Security Groups, S3, SES, MSK), GCP (BigQuery), GitHub Actions, Jenkins, Bamboo, Nexus, Docker</w:t>
       </w:r>
     </w:p>
     <w:p>
@@ -386,7 +386,7 @@
           <w:color w:val="6B797C"/>
           <w:sz w:val="19"/>
         </w:rPr>
-        <w:t>Leading integration architecture and delivery for enterprise programs spanning Salesforce, SAP S4/HANA, e-commerce, and developer platform initiatives.</w:t>
+        <w:t xml:space="preserve">Leading integration architecture and delivery for enterprise programs spanning Salesforce, SAP S4/HANA, e-commerce, and developer platforms.</w:t>
       </w:r>
     </w:p>
     <w:p>
@@ -406,64 +406,45 @@
           <w:color w:val="B8492A"/>
           <w:sz w:val="19"/>
         </w:rPr>
-        <w:t>API Developer Experience &amp; Governance</w:t>
-      </w:r>
-    </w:p>
-    <w:p>
-      <w:pPr>
-        <w:spacing w:after="60" w:line="240" w:lineRule="auto"/>
-        <w:ind w:left="360" w:hanging="200"/>
-        <w:rPr>
-          <w:rFonts w:ascii="Calibri" w:hAnsi="Calibri" w:cs="Calibri"/>
-          <w:color w:val="2B2B2B"/>
-          <w:sz w:val="20"/>
-        </w:rPr>
-      </w:pPr>
-      <w:r>
-        <w:rPr>
-          <w:rFonts w:ascii="Calibri" w:hAnsi="Calibri" w:cs="Calibri"/>
-          <w:color w:val="2B2B2B"/>
-          <w:sz w:val="20"/>
-        </w:rPr>
-        <w:t>•  Architected a centralized API catalog by integrating MuleSoft API Exchange with a Salesforce Experience Site, exposing interactive Swagger/OpenAPI docs via a custom Lightning Web Component (LWC) - boosting developer self-service and reducing API onboarding time.</w:t>
-      </w:r>
-    </w:p>
-    <w:p>
-      <w:pPr>
-        <w:spacing w:after="60" w:line="240" w:lineRule="auto"/>
-        <w:ind w:left="360" w:hanging="200"/>
-        <w:rPr>
-          <w:rFonts w:ascii="Calibri" w:hAnsi="Calibri" w:cs="Calibri"/>
-          <w:color w:val="2B2B2B"/>
-          <w:sz w:val="20"/>
-        </w:rPr>
-      </w:pPr>
-      <w:r>
-        <w:rPr>
-          <w:rFonts w:ascii="Calibri" w:hAnsi="Calibri" w:cs="Calibri"/>
-          <w:color w:val="2B2B2B"/>
-          <w:sz w:val="20"/>
-        </w:rPr>
-        <w:t>•  Configured dedicated subdomain and email services for the API portal, establishing a professional developer engagement platform aligned with enterprise governance standards.</w:t>
-      </w:r>
-    </w:p>
-    <w:p>
-      <w:pPr>
-        <w:spacing w:after="60" w:line="240" w:lineRule="auto"/>
-        <w:ind w:left="360" w:hanging="200"/>
-        <w:rPr>
-          <w:rFonts w:ascii="Calibri" w:hAnsi="Calibri" w:cs="Calibri"/>
-          <w:color w:val="2B2B2B"/>
-          <w:sz w:val="20"/>
-        </w:rPr>
-      </w:pPr>
-      <w:r>
-        <w:rPr>
-          <w:rFonts w:ascii="Calibri" w:hAnsi="Calibri" w:cs="Calibri"/>
-          <w:color w:val="2B2B2B"/>
-          <w:sz w:val="20"/>
-        </w:rPr>
-        <w:t>•  Published and customized the API Experience Hub portal, defining the organization-wide API discoverability and documentation standard.</w:t>
+        <w:t xml:space="preserve">API Developer Experience &amp; Governance</w:t>
+      </w:r>
+    </w:p>
+    <w:p>
+      <w:pPr>
+        <w:spacing w:after="60" w:line="240" w:lineRule="auto"/>
+        <w:ind w:left="360" w:hanging="200"/>
+        <w:rPr>
+          <w:rFonts w:ascii="Calibri" w:hAnsi="Calibri" w:cs="Calibri"/>
+          <w:color w:val="2B2B2B"/>
+          <w:sz w:val="20"/>
+        </w:rPr>
+      </w:pPr>
+      <w:r>
+        <w:rPr>
+          <w:rFonts w:ascii="Calibri" w:hAnsi="Calibri" w:cs="Calibri"/>
+          <w:color w:val="2B2B2B"/>
+          <w:sz w:val="20"/>
+        </w:rPr>
+        <w:t xml:space="preserve">•  Architected a centralized API catalog linking API Exchange to a Salesforce Experience Site, with Swagger/OpenAPI docs in a custom LWC, cutting API onboarding time.</w:t>
+      </w:r>
+    </w:p>
+    <w:p>
+      <w:pPr>
+        <w:spacing w:after="60" w:line="240" w:lineRule="auto"/>
+        <w:ind w:left="360" w:hanging="200"/>
+        <w:rPr>
+          <w:rFonts w:ascii="Calibri" w:hAnsi="Calibri" w:cs="Calibri"/>
+          <w:color w:val="2B2B2B"/>
+          <w:sz w:val="20"/>
+        </w:rPr>
+      </w:pPr>
+      <w:r>
+        <w:rPr>
+          <w:rFonts w:ascii="Calibri" w:hAnsi="Calibri" w:cs="Calibri"/>
+          <w:color w:val="2B2B2B"/>
+          <w:sz w:val="20"/>
+        </w:rPr>
+        <w:t xml:space="preserve">•  Published the API Experience Hub portal with its own subdomain and email services, setting the org-wide API documentation standard.</w:t>
       </w:r>
     </w:p>
     <w:p>
@@ -483,45 +464,45 @@
           <w:color w:val="B8492A"/>
           <w:sz w:val="19"/>
         </w:rPr>
-        <w:t>SAP S4/HANA Migration (MAT Program)</w:t>
-      </w:r>
-    </w:p>
-    <w:p>
-      <w:pPr>
-        <w:spacing w:after="60" w:line="240" w:lineRule="auto"/>
-        <w:ind w:left="360" w:hanging="200"/>
-        <w:rPr>
-          <w:rFonts w:ascii="Calibri" w:hAnsi="Calibri" w:cs="Calibri"/>
-          <w:color w:val="2B2B2B"/>
-          <w:sz w:val="20"/>
-        </w:rPr>
-      </w:pPr>
-      <w:r>
-        <w:rPr>
-          <w:rFonts w:ascii="Calibri" w:hAnsi="Calibri" w:cs="Calibri"/>
-          <w:color w:val="2B2B2B"/>
-          <w:sz w:val="20"/>
-        </w:rPr>
-        <w:t>•  Designed and delivered the integration layer for a strategic accounts management platform migration from a legacy on-premise system to SAP S4/HANA - pulling data from the TRAX system, transforming it to a canonical data model, and publishing to SAP via OData/SOAP services.</w:t>
-      </w:r>
-    </w:p>
-    <w:p>
-      <w:pPr>
-        <w:spacing w:after="60" w:line="240" w:lineRule="auto"/>
-        <w:ind w:left="360" w:hanging="200"/>
-        <w:rPr>
-          <w:rFonts w:ascii="Calibri" w:hAnsi="Calibri" w:cs="Calibri"/>
-          <w:color w:val="2B2B2B"/>
-          <w:sz w:val="20"/>
-        </w:rPr>
-      </w:pPr>
-      <w:r>
-        <w:rPr>
-          <w:rFonts w:ascii="Calibri" w:hAnsi="Calibri" w:cs="Calibri"/>
-          <w:color w:val="2B2B2B"/>
-          <w:sz w:val="20"/>
-        </w:rPr>
-        <w:t>•  Deployed all APIs to Runtime Fabric (RTF) and established Anypoint Monitoring dashboards for real-time SLA visibility and operational governance.</w:t>
+        <w:t xml:space="preserve">SAP S4/HANA Migration (MAT Program)</w:t>
+      </w:r>
+    </w:p>
+    <w:p>
+      <w:pPr>
+        <w:spacing w:after="60" w:line="240" w:lineRule="auto"/>
+        <w:ind w:left="360" w:hanging="200"/>
+        <w:rPr>
+          <w:rFonts w:ascii="Calibri" w:hAnsi="Calibri" w:cs="Calibri"/>
+          <w:color w:val="2B2B2B"/>
+          <w:sz w:val="20"/>
+        </w:rPr>
+      </w:pPr>
+      <w:r>
+        <w:rPr>
+          <w:rFonts w:ascii="Calibri" w:hAnsi="Calibri" w:cs="Calibri"/>
+          <w:color w:val="2B2B2B"/>
+          <w:sz w:val="20"/>
+        </w:rPr>
+        <w:t xml:space="preserve">•  Delivered the integration layer migrating a strategic accounts platform to SAP S4/HANA: TRAX data mapped to a canonical model and published via OData and SOAP.</w:t>
+      </w:r>
+    </w:p>
+    <w:p>
+      <w:pPr>
+        <w:spacing w:after="60" w:line="240" w:lineRule="auto"/>
+        <w:ind w:left="360" w:hanging="200"/>
+        <w:rPr>
+          <w:rFonts w:ascii="Calibri" w:hAnsi="Calibri" w:cs="Calibri"/>
+          <w:color w:val="2B2B2B"/>
+          <w:sz w:val="20"/>
+        </w:rPr>
+      </w:pPr>
+      <w:r>
+        <w:rPr>
+          <w:rFonts w:ascii="Calibri" w:hAnsi="Calibri" w:cs="Calibri"/>
+          <w:color w:val="2B2B2B"/>
+          <w:sz w:val="20"/>
+        </w:rPr>
+        <w:t xml:space="preserve">•  Deployed all APIs to Runtime Fabric with Anypoint Monitoring dashboards for SLA visibility.</w:t>
       </w:r>
     </w:p>
     <w:p>
@@ -541,45 +522,45 @@
           <w:color w:val="B8492A"/>
           <w:sz w:val="19"/>
         </w:rPr>
-        <w:t>E-Commerce Integration - Salesforce &amp; Hybris</w:t>
-      </w:r>
-    </w:p>
-    <w:p>
-      <w:pPr>
-        <w:spacing w:after="60" w:line="240" w:lineRule="auto"/>
-        <w:ind w:left="360" w:hanging="200"/>
-        <w:rPr>
-          <w:rFonts w:ascii="Calibri" w:hAnsi="Calibri" w:cs="Calibri"/>
-          <w:color w:val="2B2B2B"/>
-          <w:sz w:val="20"/>
-        </w:rPr>
-      </w:pPr>
-      <w:r>
-        <w:rPr>
-          <w:rFonts w:ascii="Calibri" w:hAnsi="Calibri" w:cs="Calibri"/>
-          <w:color w:val="2B2B2B"/>
-          <w:sz w:val="20"/>
-        </w:rPr>
-        <w:t>•  Built a full suite of Mule 4 commerce APIs connecting Salesforce and Hybris: Create/Update/Get Cart, Get Delivery Options, Add Promotions, Create &amp; Publish Order - enabling seamless end-to-end order lifecycle orchestration.</w:t>
-      </w:r>
-    </w:p>
-    <w:p>
-      <w:pPr>
-        <w:spacing w:after="60" w:line="240" w:lineRule="auto"/>
-        <w:ind w:left="360" w:hanging="200"/>
-        <w:rPr>
-          <w:rFonts w:ascii="Calibri" w:hAnsi="Calibri" w:cs="Calibri"/>
-          <w:color w:val="2B2B2B"/>
-          <w:sz w:val="20"/>
-        </w:rPr>
-      </w:pPr>
-      <w:r>
-        <w:rPr>
-          <w:rFonts w:ascii="Calibri" w:hAnsi="Calibri" w:cs="Calibri"/>
-          <w:color w:val="2B2B2B"/>
-          <w:sz w:val="20"/>
-        </w:rPr>
-        <w:t>•  Implemented Anypoint MQ for asynchronous decoupling between commerce events and integrated Salesforce Apex callbacks within the API layer.</w:t>
+        <w:t xml:space="preserve">E-Commerce Integration - Salesforce &amp; Hybris</w:t>
+      </w:r>
+    </w:p>
+    <w:p>
+      <w:pPr>
+        <w:spacing w:after="60" w:line="240" w:lineRule="auto"/>
+        <w:ind w:left="360" w:hanging="200"/>
+        <w:rPr>
+          <w:rFonts w:ascii="Calibri" w:hAnsi="Calibri" w:cs="Calibri"/>
+          <w:color w:val="2B2B2B"/>
+          <w:sz w:val="20"/>
+        </w:rPr>
+      </w:pPr>
+      <w:r>
+        <w:rPr>
+          <w:rFonts w:ascii="Calibri" w:hAnsi="Calibri" w:cs="Calibri"/>
+          <w:color w:val="2B2B2B"/>
+          <w:sz w:val="20"/>
+        </w:rPr>
+        <w:t xml:space="preserve">•  Built Mule 4 commerce APIs (cart, delivery, promotions, orders) between Salesforce and Hybris for end-to-end order lifecycle orchestration.</w:t>
+      </w:r>
+    </w:p>
+    <w:p>
+      <w:pPr>
+        <w:spacing w:after="60" w:line="240" w:lineRule="auto"/>
+        <w:ind w:left="360" w:hanging="200"/>
+        <w:rPr>
+          <w:rFonts w:ascii="Calibri" w:hAnsi="Calibri" w:cs="Calibri"/>
+          <w:color w:val="2B2B2B"/>
+          <w:sz w:val="20"/>
+        </w:rPr>
+      </w:pPr>
+      <w:r>
+        <w:rPr>
+          <w:rFonts w:ascii="Calibri" w:hAnsi="Calibri" w:cs="Calibri"/>
+          <w:color w:val="2B2B2B"/>
+          <w:sz w:val="20"/>
+        </w:rPr>
+        <w:t xml:space="preserve">•  Decoupled commerce events with Anypoint MQ and Salesforce Apex callbacks.</w:t>
       </w:r>
     </w:p>
     <w:p>
@@ -599,216 +580,370 @@
           <w:color w:val="B8492A"/>
           <w:sz w:val="19"/>
         </w:rPr>
-        <w:t>Platform Engineering &amp; Innovation</w:t>
-      </w:r>
-    </w:p>
-    <w:p>
-      <w:pPr>
-        <w:spacing w:after="60" w:line="240" w:lineRule="auto"/>
-        <w:ind w:left="360" w:hanging="200"/>
-        <w:rPr>
-          <w:rFonts w:ascii="Calibri" w:hAnsi="Calibri" w:cs="Calibri"/>
-          <w:color w:val="2B2B2B"/>
-          <w:sz w:val="20"/>
-        </w:rPr>
-      </w:pPr>
-      <w:r>
-        <w:rPr>
-          <w:rFonts w:ascii="Calibri" w:hAnsi="Calibri" w:cs="Calibri"/>
-          <w:color w:val="2B2B2B"/>
-          <w:sz w:val="20"/>
-        </w:rPr>
-        <w:t>•  Engineered AWS Signature V4 signing logic to authenticate against AWS SES API - establishing the reusable security pattern for all AWS service integrations.</w:t>
-      </w:r>
-    </w:p>
-    <w:p>
-      <w:pPr>
-        <w:spacing w:after="60" w:line="240" w:lineRule="auto"/>
-        <w:ind w:left="360" w:hanging="200"/>
-        <w:rPr>
-          <w:rFonts w:ascii="Calibri" w:hAnsi="Calibri" w:cs="Calibri"/>
-          <w:color w:val="2B2B2B"/>
-          <w:sz w:val="20"/>
-        </w:rPr>
-      </w:pPr>
-      <w:r>
-        <w:rPr>
-          <w:rFonts w:ascii="Calibri" w:hAnsi="Calibri" w:cs="Calibri"/>
-          <w:color w:val="2B2B2B"/>
-          <w:sz w:val="20"/>
-        </w:rPr>
-        <w:t>•  Implemented Salesforce JWT authentication using RSA public/private key pairs, replacing fragile credential-based auth and setting the enterprise standard for Salesforce connectivity.</w:t>
-      </w:r>
-    </w:p>
-    <w:p>
-      <w:pPr>
-        <w:spacing w:after="60" w:line="240" w:lineRule="auto"/>
-        <w:ind w:left="360" w:hanging="200"/>
-        <w:rPr>
-          <w:rFonts w:ascii="Calibri" w:hAnsi="Calibri" w:cs="Calibri"/>
-          <w:color w:val="2B2B2B"/>
-          <w:sz w:val="20"/>
-        </w:rPr>
-      </w:pPr>
-      <w:r>
-        <w:rPr>
-          <w:rFonts w:ascii="Calibri" w:hAnsi="Calibri" w:cs="Calibri"/>
-          <w:color w:val="2B2B2B"/>
-          <w:sz w:val="20"/>
-        </w:rPr>
-        <w:t>•  Automated Flex Gateway API deployments via GitHub Actions workflows, eliminating manual deployment steps and enabling full infrastructure-as-code for API gateway management.</w:t>
-      </w:r>
-    </w:p>
-    <w:p>
-      <w:pPr>
-        <w:spacing w:after="60" w:line="240" w:lineRule="auto"/>
-        <w:ind w:left="360" w:hanging="200"/>
-        <w:rPr>
-          <w:rFonts w:ascii="Calibri" w:hAnsi="Calibri" w:cs="Calibri"/>
-          <w:color w:val="2B2B2B"/>
-          <w:sz w:val="20"/>
-        </w:rPr>
-      </w:pPr>
-      <w:r>
-        <w:rPr>
-          <w:rFonts w:ascii="Calibri" w:hAnsi="Calibri" w:cs="Calibri"/>
-          <w:color w:val="2B2B2B"/>
-          <w:sz w:val="20"/>
-        </w:rPr>
-        <w:t>•  Solved a critical data pipeline constraint by architecting large-payload (10MB+) streaming over Kafka within Mule, enabling high-volume file delivery without timeouts.</w:t>
-      </w:r>
-    </w:p>
-    <w:p>
-      <w:pPr>
-        <w:spacing w:after="60" w:line="240" w:lineRule="auto"/>
-        <w:ind w:left="360" w:hanging="200"/>
-        <w:rPr>
-          <w:rFonts w:ascii="Calibri" w:hAnsi="Calibri" w:cs="Calibri"/>
-          <w:color w:val="2B2B2B"/>
-          <w:sz w:val="20"/>
-        </w:rPr>
-      </w:pPr>
-      <w:r>
-        <w:rPr>
-          <w:rFonts w:ascii="Calibri" w:hAnsi="Calibri" w:cs="Calibri"/>
-          <w:color w:val="2B2B2B"/>
-          <w:sz w:val="20"/>
-        </w:rPr>
-        <w:t>•  Built XML SDK and Java SDK custom connectors for centralized logging and transaction tracking, deployed platform-wide for audit and observability.</w:t>
-      </w:r>
-    </w:p>
-    <w:p>
-      <w:pPr>
-        <w:spacing w:after="60" w:line="240" w:lineRule="auto"/>
-        <w:ind w:left="360" w:hanging="200"/>
-        <w:rPr>
-          <w:rFonts w:ascii="Calibri" w:hAnsi="Calibri" w:cs="Calibri"/>
-          <w:color w:val="2B2B2B"/>
-          <w:sz w:val="20"/>
-        </w:rPr>
-      </w:pPr>
-      <w:r>
-        <w:rPr>
-          <w:rFonts w:ascii="Calibri" w:hAnsi="Calibri" w:cs="Calibri"/>
-          <w:color w:val="2B2B2B"/>
-          <w:sz w:val="20"/>
-        </w:rPr>
-        <w:t>•  Led Java 17 runtime migration across Mule applications - identified compatibility issues, authored migration runbook, and coordinated remediation with development teams.</w:t>
-      </w:r>
-    </w:p>
-    <w:p>
-      <w:pPr>
-        <w:spacing w:after="60" w:line="240" w:lineRule="auto"/>
-        <w:ind w:left="360" w:hanging="200"/>
-        <w:rPr>
-          <w:rFonts w:ascii="Calibri" w:hAnsi="Calibri" w:cs="Calibri"/>
-          <w:color w:val="2B2B2B"/>
-          <w:sz w:val="20"/>
-        </w:rPr>
-      </w:pPr>
-      <w:r>
-        <w:rPr>
-          <w:rFonts w:ascii="Calibri" w:hAnsi="Calibri" w:cs="Calibri"/>
-          <w:color w:val="2B2B2B"/>
-          <w:sz w:val="20"/>
-        </w:rPr>
-        <w:t>•  Integrated Jira connector for automated ticket creation on failed transactions, reducing MTTR by removing manual incident logging.</w:t>
-      </w:r>
-    </w:p>
-    <w:p>
-      <w:pPr>
-        <w:spacing w:after="60" w:line="240" w:lineRule="auto"/>
-        <w:ind w:left="360" w:hanging="200"/>
-        <w:rPr>
-          <w:rFonts w:ascii="Calibri" w:hAnsi="Calibri" w:cs="Calibri"/>
-          <w:color w:val="2B2B2B"/>
-          <w:sz w:val="20"/>
-        </w:rPr>
-      </w:pPr>
-      <w:r>
-        <w:rPr>
-          <w:rFonts w:ascii="Calibri" w:hAnsi="Calibri" w:cs="Calibri"/>
-          <w:color w:val="2B2B2B"/>
-          <w:sz w:val="20"/>
-        </w:rPr>
-        <w:t>•  Configured Microsoft Outlook 365 connector using Microsoft Graph API for LOB notification workflows; connected AWS SES for customer-facing email delivery.</w:t>
-      </w:r>
-    </w:p>
-    <w:p>
-      <w:pPr>
-        <w:spacing w:after="60" w:line="240" w:lineRule="auto"/>
-        <w:ind w:left="360" w:hanging="200"/>
-        <w:rPr>
-          <w:rFonts w:ascii="Calibri" w:hAnsi="Calibri" w:cs="Calibri"/>
-          <w:color w:val="2B2B2B"/>
-          <w:sz w:val="20"/>
-        </w:rPr>
-      </w:pPr>
-      <w:r>
-        <w:rPr>
-          <w:rFonts w:ascii="Calibri" w:hAnsi="Calibri" w:cs="Calibri"/>
-          <w:color w:val="2B2B2B"/>
-          <w:sz w:val="20"/>
-        </w:rPr>
-        <w:t>•  Migrated legacy DataMapper (.grf) transformations to DataWeave (.dwl), modernizing the integration codebase for Mule 4 compatibility.</w:t>
-      </w:r>
-    </w:p>
-    <w:p>
-      <w:pPr>
-        <w:spacing w:after="60" w:line="240" w:lineRule="auto"/>
-        <w:ind w:left="360" w:hanging="200"/>
-        <w:rPr>
-          <w:rFonts w:ascii="Calibri" w:hAnsi="Calibri" w:cs="Calibri"/>
-          <w:color w:val="2B2B2B"/>
-          <w:sz w:val="20"/>
-        </w:rPr>
-      </w:pPr>
-      <w:r>
-        <w:rPr>
-          <w:rFonts w:ascii="Calibri" w:hAnsi="Calibri" w:cs="Calibri"/>
-          <w:color w:val="2B2B2B"/>
-          <w:sz w:val="20"/>
-        </w:rPr>
-        <w:t>•  Designed and deployed a Spring Boot / Kafka consumer microservice for real-time invoice status processing - validating event schema and persisting updates to MySQL.</w:t>
-      </w:r>
-    </w:p>
-    <w:p>
-      <w:pPr>
-        <w:spacing w:after="60" w:line="240" w:lineRule="auto"/>
-        <w:ind w:left="360" w:hanging="200"/>
-        <w:rPr>
-          <w:rFonts w:ascii="Calibri" w:hAnsi="Calibri" w:cs="Calibri"/>
-          <w:color w:val="2B2B2B"/>
-          <w:sz w:val="20"/>
-        </w:rPr>
-      </w:pPr>
-      <w:r>
-        <w:rPr>
-          <w:rFonts w:ascii="Calibri" w:hAnsi="Calibri" w:cs="Calibri"/>
-          <w:color w:val="2B2B2B"/>
-          <w:sz w:val="20"/>
-        </w:rPr>
-        <w:t>•  Architected a TypeScript / Hono loyalty services gateway exposing five loyalty operations (earn, redeem, cancel, get, cancel-redeem) to backend Spring Boot services.</w:t>
+        <w:t xml:space="preserve">Platform Engineering &amp; Innovation</w:t>
+      </w:r>
+    </w:p>
+    <w:p>
+      <w:pPr>
+        <w:spacing w:after="60" w:line="240" w:lineRule="auto"/>
+        <w:ind w:left="360" w:hanging="200"/>
+        <w:rPr>
+          <w:rFonts w:ascii="Calibri" w:hAnsi="Calibri" w:cs="Calibri"/>
+          <w:color w:val="2B2B2B"/>
+          <w:sz w:val="20"/>
+        </w:rPr>
+      </w:pPr>
+      <w:r>
+        <w:rPr>
+          <w:rFonts w:ascii="Calibri" w:hAnsi="Calibri" w:cs="Calibri"/>
+          <w:color w:val="2B2B2B"/>
+          <w:sz w:val="20"/>
+        </w:rPr>
+        <w:t xml:space="preserve">•  Built AWS Signature V4 signing for AWS SES, the reusable pattern for all AWS integrations.</w:t>
+      </w:r>
+    </w:p>
+    <w:p>
+      <w:pPr>
+        <w:spacing w:after="60" w:line="240" w:lineRule="auto"/>
+        <w:ind w:left="360" w:hanging="200"/>
+        <w:rPr>
+          <w:rFonts w:ascii="Calibri" w:hAnsi="Calibri" w:cs="Calibri"/>
+          <w:color w:val="2B2B2B"/>
+          <w:sz w:val="20"/>
+        </w:rPr>
+      </w:pPr>
+      <w:r>
+        <w:rPr>
+          <w:rFonts w:ascii="Calibri" w:hAnsi="Calibri" w:cs="Calibri"/>
+          <w:color w:val="2B2B2B"/>
+          <w:sz w:val="20"/>
+        </w:rPr>
+        <w:t xml:space="preserve">•  Implemented Salesforce JWT auth with RSA key pairs, the enterprise standard for Salesforce.</w:t>
+      </w:r>
+    </w:p>
+    <w:p>
+      <w:pPr>
+        <w:spacing w:after="60" w:line="240" w:lineRule="auto"/>
+        <w:ind w:left="360" w:hanging="200"/>
+        <w:rPr>
+          <w:rFonts w:ascii="Calibri" w:hAnsi="Calibri" w:cs="Calibri"/>
+          <w:color w:val="2B2B2B"/>
+          <w:sz w:val="20"/>
+        </w:rPr>
+      </w:pPr>
+      <w:r>
+        <w:rPr>
+          <w:rFonts w:ascii="Calibri" w:hAnsi="Calibri" w:cs="Calibri"/>
+          <w:color w:val="2B2B2B"/>
+          <w:sz w:val="20"/>
+        </w:rPr>
+        <w:t xml:space="preserve">•  Implemented Kafka streaming for 10 MB+ payloads in Mule, removing delivery timeouts.</w:t>
+      </w:r>
+    </w:p>
+    <w:p>
+      <w:pPr>
+        <w:spacing w:after="60" w:line="240" w:lineRule="auto"/>
+        <w:ind w:left="360" w:hanging="200"/>
+        <w:rPr>
+          <w:rFonts w:ascii="Calibri" w:hAnsi="Calibri" w:cs="Calibri"/>
+          <w:color w:val="2B2B2B"/>
+          <w:sz w:val="20"/>
+        </w:rPr>
+      </w:pPr>
+      <w:r>
+        <w:rPr>
+          <w:rFonts w:ascii="Calibri" w:hAnsi="Calibri" w:cs="Calibri"/>
+          <w:color w:val="2B2B2B"/>
+          <w:sz w:val="20"/>
+        </w:rPr>
+        <w:t xml:space="preserve">•  Automated Flex Gateway deployments via GitHub Actions as infrastructure-as-code.</w:t>
+      </w:r>
+    </w:p>
+    <w:p>
+      <w:pPr>
+        <w:spacing w:after="60" w:line="240" w:lineRule="auto"/>
+        <w:ind w:left="360" w:hanging="200"/>
+        <w:rPr>
+          <w:rFonts w:ascii="Calibri" w:hAnsi="Calibri" w:cs="Calibri"/>
+          <w:color w:val="2B2B2B"/>
+          <w:sz w:val="20"/>
+        </w:rPr>
+      </w:pPr>
+      <w:r>
+        <w:rPr>
+          <w:rFonts w:ascii="Calibri" w:hAnsi="Calibri" w:cs="Calibri"/>
+          <w:color w:val="2B2B2B"/>
+          <w:sz w:val="20"/>
+        </w:rPr>
+        <w:t xml:space="preserve">•  Built XML/Java SDK custom connectors for platform-wide logging and transaction tracking.</w:t>
+      </w:r>
+    </w:p>
+    <w:p>
+      <w:pPr>
+        <w:spacing w:after="60" w:line="240" w:lineRule="auto"/>
+        <w:ind w:left="360" w:hanging="200"/>
+        <w:rPr>
+          <w:rFonts w:ascii="Calibri" w:hAnsi="Calibri" w:cs="Calibri"/>
+          <w:color w:val="2B2B2B"/>
+          <w:sz w:val="20"/>
+        </w:rPr>
+      </w:pPr>
+      <w:r>
+        <w:rPr>
+          <w:rFonts w:ascii="Calibri" w:hAnsi="Calibri" w:cs="Calibri"/>
+          <w:color w:val="2B2B2B"/>
+          <w:sz w:val="20"/>
+        </w:rPr>
+        <w:t xml:space="preserve">•  Led the Java 17 migration across Mule apps, authoring the runbook and coordinating fixes.</w:t>
+      </w:r>
+    </w:p>
+    <w:p>
+      <w:pPr>
+        <w:spacing w:after="60" w:line="240" w:lineRule="auto"/>
+        <w:ind w:left="360" w:hanging="200"/>
+        <w:rPr>
+          <w:rFonts w:ascii="Calibri" w:hAnsi="Calibri" w:cs="Calibri"/>
+          <w:color w:val="2B2B2B"/>
+          <w:sz w:val="20"/>
+        </w:rPr>
+      </w:pPr>
+      <w:r>
+        <w:rPr>
+          <w:rFonts w:ascii="Calibri" w:hAnsi="Calibri" w:cs="Calibri"/>
+          <w:color w:val="2B2B2B"/>
+          <w:sz w:val="20"/>
+        </w:rPr>
+        <w:t xml:space="preserve">•  Automated Jira tickets on failed transactions, reducing MTTR.</w:t>
+      </w:r>
+    </w:p>
+    <w:p>
+      <w:pPr>
+        <w:spacing w:after="60" w:line="240" w:lineRule="auto"/>
+        <w:ind w:left="360" w:hanging="200"/>
+        <w:rPr>
+          <w:rFonts w:ascii="Calibri" w:hAnsi="Calibri" w:cs="Calibri"/>
+          <w:color w:val="2B2B2B"/>
+          <w:sz w:val="20"/>
+        </w:rPr>
+      </w:pPr>
+      <w:r>
+        <w:rPr>
+          <w:rFonts w:ascii="Calibri" w:hAnsi="Calibri" w:cs="Calibri"/>
+          <w:color w:val="2B2B2B"/>
+          <w:sz w:val="20"/>
+        </w:rPr>
+        <w:t xml:space="preserve">•  Built a Spring Boot / Kafka consumer for real-time invoice status, persisting to MySQL.</w:t>
+      </w:r>
+    </w:p>
+    <w:p>
+      <w:pPr>
+        <w:spacing w:after="60" w:line="240" w:lineRule="auto"/>
+        <w:ind w:left="360" w:hanging="200"/>
+        <w:rPr>
+          <w:rFonts w:ascii="Calibri" w:hAnsi="Calibri" w:cs="Calibri"/>
+          <w:color w:val="2B2B2B"/>
+          <w:sz w:val="20"/>
+        </w:rPr>
+      </w:pPr>
+      <w:r>
+        <w:rPr>
+          <w:rFonts w:ascii="Calibri" w:hAnsi="Calibri" w:cs="Calibri"/>
+          <w:color w:val="2B2B2B"/>
+          <w:sz w:val="20"/>
+        </w:rPr>
+        <w:t xml:space="preserve">•  Architected a TypeScript / Hono loyalty gateway fronting Spring Boot services.</w:t>
+      </w:r>
+    </w:p>
+    <w:p>
+      <w:pPr>
+        <w:spacing w:after="60" w:line="240" w:lineRule="auto"/>
+        <w:ind w:left="360" w:hanging="200"/>
+        <w:rPr>
+          <w:rFonts w:ascii="Calibri" w:hAnsi="Calibri" w:cs="Calibri"/>
+          <w:color w:val="2B2B2B"/>
+          <w:sz w:val="20"/>
+        </w:rPr>
+      </w:pPr>
+      <w:r>
+        <w:rPr>
+          <w:rFonts w:ascii="Calibri" w:hAnsi="Calibri" w:cs="Calibri"/>
+          <w:color w:val="2B2B2B"/>
+          <w:sz w:val="20"/>
+        </w:rPr>
+        <w:t xml:space="preserve">•  Wired Outlook 365 (Graph API) and AWS SES for business and customer notifications.</w:t>
+      </w:r>
+    </w:p>
+    <w:p>
+      <w:pPr>
+        <w:spacing w:after="60" w:line="240" w:lineRule="auto"/>
+        <w:ind w:left="360" w:hanging="200"/>
+        <w:rPr>
+          <w:rFonts w:ascii="Calibri" w:hAnsi="Calibri" w:cs="Calibri"/>
+          <w:color w:val="2B2B2B"/>
+          <w:sz w:val="20"/>
+        </w:rPr>
+      </w:pPr>
+      <w:r>
+        <w:rPr>
+          <w:rFonts w:ascii="Calibri" w:hAnsi="Calibri" w:cs="Calibri"/>
+          <w:color w:val="2B2B2B"/>
+          <w:sz w:val="20"/>
+        </w:rPr>
+        <w:t xml:space="preserve">•  Migrated legacy DataMapper transformations to DataWeave for Mule 4.</w:t>
+      </w:r>
+    </w:p>
+    <w:p>
+      <w:pPr>
+        <w:spacing w:before="140" w:after="60" w:line="240" w:lineRule="auto"/>
+        <w:rPr>
+          <w:rFonts w:ascii="Calibri" w:hAnsi="Calibri" w:cs="Calibri"/>
+          <w:b/>
+          <w:color w:val="B8492A"/>
+          <w:sz w:val="19"/>
+        </w:rPr>
+      </w:pPr>
+      <w:r>
+        <w:rPr>
+          <w:rFonts w:ascii="Calibri" w:hAnsi="Calibri" w:cs="Calibri"/>
+          <w:b/>
+          <w:color w:val="B8492A"/>
+          <w:sz w:val="19"/>
+        </w:rPr>
+        <w:t xml:space="preserve">MuleSoft Platform</w:t>
+      </w:r>
+    </w:p>
+    <w:p>
+      <w:pPr>
+        <w:spacing w:after="60" w:line="240" w:lineRule="auto"/>
+        <w:ind w:left="360" w:hanging="200"/>
+        <w:rPr>
+          <w:rFonts w:ascii="Calibri" w:hAnsi="Calibri" w:cs="Calibri"/>
+          <w:color w:val="2B2B2B"/>
+          <w:sz w:val="20"/>
+        </w:rPr>
+      </w:pPr>
+      <w:r>
+        <w:rPr>
+          <w:rFonts w:ascii="Calibri" w:hAnsi="Calibri" w:cs="Calibri"/>
+          <w:color w:val="2B2B2B"/>
+          <w:sz w:val="20"/>
+        </w:rPr>
+        <w:t xml:space="preserve">•  Built Terraform IaC to deploy and configure APIs on MuleSoft Omni Gateway, giving consistent, repeatable deployments across environments.</w:t>
+      </w:r>
+    </w:p>
+    <w:p>
+      <w:pPr>
+        <w:spacing w:after="60" w:line="240" w:lineRule="auto"/>
+        <w:ind w:left="360" w:hanging="200"/>
+        <w:rPr>
+          <w:rFonts w:ascii="Calibri" w:hAnsi="Calibri" w:cs="Calibri"/>
+          <w:color w:val="2B2B2B"/>
+          <w:sz w:val="20"/>
+        </w:rPr>
+      </w:pPr>
+      <w:r>
+        <w:rPr>
+          <w:rFonts w:ascii="Calibri" w:hAnsi="Calibri" w:cs="Calibri"/>
+          <w:color w:val="2B2B2B"/>
+          <w:sz w:val="20"/>
+        </w:rPr>
+        <w:t xml:space="preserve">•  Applied MuleSoft API management and gateway capabilities for secure API exposure in platform modernization.</w:t>
+      </w:r>
+    </w:p>
+    <w:p>
+      <w:pPr>
+        <w:spacing w:before="140" w:after="60" w:line="240" w:lineRule="auto"/>
+        <w:rPr>
+          <w:rFonts w:ascii="Calibri" w:hAnsi="Calibri" w:cs="Calibri"/>
+          <w:b/>
+          <w:color w:val="B8492A"/>
+          <w:sz w:val="19"/>
+        </w:rPr>
+      </w:pPr>
+      <w:r>
+        <w:rPr>
+          <w:rFonts w:ascii="Calibri" w:hAnsi="Calibri" w:cs="Calibri"/>
+          <w:b/>
+          <w:color w:val="B8492A"/>
+          <w:sz w:val="19"/>
+        </w:rPr>
+        <w:t xml:space="preserve">AWS / Cloud Engineering</w:t>
+      </w:r>
+    </w:p>
+    <w:p>
+      <w:pPr>
+        <w:spacing w:after="60" w:line="240" w:lineRule="auto"/>
+        <w:ind w:left="360" w:hanging="200"/>
+        <w:rPr>
+          <w:rFonts w:ascii="Calibri" w:hAnsi="Calibri" w:cs="Calibri"/>
+          <w:color w:val="2B2B2B"/>
+          <w:sz w:val="20"/>
+        </w:rPr>
+      </w:pPr>
+      <w:r>
+        <w:rPr>
+          <w:rFonts w:ascii="Calibri" w:hAnsi="Calibri" w:cs="Calibri"/>
+          <w:color w:val="2B2B2B"/>
+          <w:sz w:val="20"/>
+        </w:rPr>
+        <w:t xml:space="preserve">•  Built serverless AWS Lambda jobs for MySQL data processing, status updates and daily email reports.</w:t>
+      </w:r>
+    </w:p>
+    <w:p>
+      <w:pPr>
+        <w:spacing w:after="60" w:line="240" w:lineRule="auto"/>
+        <w:ind w:left="360" w:hanging="200"/>
+        <w:rPr>
+          <w:rFonts w:ascii="Calibri" w:hAnsi="Calibri" w:cs="Calibri"/>
+          <w:color w:val="2B2B2B"/>
+          <w:sz w:val="20"/>
+        </w:rPr>
+      </w:pPr>
+      <w:r>
+        <w:rPr>
+          <w:rFonts w:ascii="Calibri" w:hAnsi="Calibri" w:cs="Calibri"/>
+          <w:color w:val="2B2B2B"/>
+          <w:sz w:val="20"/>
+        </w:rPr>
+        <w:t xml:space="preserve">•  Fronted existing Spring Boot services with Amazon API Gateway for secure, scalable access.</w:t>
+      </w:r>
+    </w:p>
+    <w:p>
+      <w:pPr>
+        <w:spacing w:after="60" w:line="240" w:lineRule="auto"/>
+        <w:ind w:left="360" w:hanging="200"/>
+        <w:rPr>
+          <w:rFonts w:ascii="Calibri" w:hAnsi="Calibri" w:cs="Calibri"/>
+          <w:color w:val="2B2B2B"/>
+          <w:sz w:val="20"/>
+        </w:rPr>
+      </w:pPr>
+      <w:r>
+        <w:rPr>
+          <w:rFonts w:ascii="Calibri" w:hAnsi="Calibri" w:cs="Calibri"/>
+          <w:color w:val="2B2B2B"/>
+          <w:sz w:val="20"/>
+        </w:rPr>
+        <w:t xml:space="preserve">•  Improved CI/CD and deployment processes in platform modernization work, speeding releases.</w:t>
+      </w:r>
+    </w:p>
+    <w:p>
+      <w:pPr>
+        <w:spacing w:after="60" w:line="240" w:lineRule="auto"/>
+        <w:ind w:left="360" w:hanging="200"/>
+        <w:rPr>
+          <w:rFonts w:ascii="Calibri" w:hAnsi="Calibri" w:cs="Calibri"/>
+          <w:color w:val="2B2B2B"/>
+          <w:sz w:val="20"/>
+        </w:rPr>
+      </w:pPr>
+      <w:r>
+        <w:rPr>
+          <w:rFonts w:ascii="Calibri" w:hAnsi="Calibri" w:cs="Calibri"/>
+          <w:color w:val="2B2B2B"/>
+          <w:sz w:val="20"/>
+        </w:rPr>
+        <w:t xml:space="preserve">•  Managed IAM roles and permissions and service-to-service access across AWS workloads.</w:t>
       </w:r>
     </w:p>
     <w:p>

</xml_diff>

<commit_message>
Refresh resume for MuleSoft platform work
Updated the resume PDF/DOCX and resume page to highlight recent MuleSoft platform work, including a custom dynamic client registration integration with PingFederate, Terraform IaC for Omni Gateway deployments, and API governance experience. This keeps the profile aligned with current platform architecture and API management work.
</commit_message>
<xml_diff>
--- a/resumes/Thayagapriyan-Dravidamani-Resume.docx
+++ b/resumes/Thayagapriyan-Dravidamani-Resume.docx
@@ -810,6 +810,25 @@
           <w:sz w:val="19"/>
         </w:rPr>
         <w:t xml:space="preserve">MuleSoft Platform</w:t>
+      </w:r>
+    </w:p>
+    <w:p>
+      <w:pPr>
+        <w:spacing w:after="60" w:line="240" w:lineRule="auto"/>
+        <w:ind w:left="360" w:hanging="200"/>
+        <w:rPr>
+          <w:rFonts w:ascii="Calibri" w:hAnsi="Calibri" w:cs="Calibri"/>
+          <w:color w:val="2B2B2B"/>
+          <w:sz w:val="20"/>
+        </w:rPr>
+      </w:pPr>
+      <w:r>
+        <w:rPr>
+          <w:rFonts w:ascii="Calibri" w:hAnsi="Calibri" w:cs="Calibri"/>
+          <w:color w:val="2B2B2B"/>
+          <w:sz w:val="20"/>
+        </w:rPr>
+        <w:t xml:space="preserve">•  Architected a custom dynamic client registration solution integrating MuleSoft with PingFederate, automating API client onboarding and identity management.</w:t>
       </w:r>
     </w:p>
     <w:p>

</xml_diff>